<commit_message>
Cambios de casos de usos y subida de Manual
</commit_message>
<xml_diff>
--- a/01. UML/01. ERS/ERS_SOAP_DOTNET_BDD_GR05.docx
+++ b/01. UML/01. ERS/ERS_SOAP_DOTNET_BDD_GR05.docx
@@ -2155,10 +2155,16 @@
                               <w:spacing w:line="275" w:lineRule="auto"/>
                               <w:jc w:val="center"/>
                               <w:textDirection w:val="btLr"/>
+                              <w:rPr>
+                                <w:b/>
+                                <w:bCs/>
+                              </w:rPr>
                             </w:pPr>
                             <w:r>
                               <w:rPr>
                                 <w:rFonts w:ascii="Calibri" w:eastAsia="Calibri" w:hAnsi="Calibri" w:cs="Calibri"/>
+                                <w:b/>
+                                <w:bCs/>
                                 <w:color w:val="000000"/>
                                 <w:sz w:val="44"/>
                               </w:rPr>
@@ -2167,6 +2173,8 @@
                             <w:r>
                               <w:rPr>
                                 <w:rFonts w:ascii="Calibri" w:eastAsia="Calibri" w:hAnsi="Calibri" w:cs="Calibri"/>
+                                <w:b/>
+                                <w:bCs/>
                                 <w:color w:val="000000"/>
                                 <w:sz w:val="44"/>
                               </w:rPr>
@@ -2175,6 +2183,8 @@
                             <w:r>
                               <w:rPr>
                                 <w:rFonts w:ascii="Calibri" w:eastAsia="Calibri" w:hAnsi="Calibri" w:cs="Calibri"/>
+                                <w:b/>
+                                <w:bCs/>
                                 <w:color w:val="000000"/>
                                 <w:sz w:val="44"/>
                               </w:rPr>
@@ -2183,6 +2193,8 @@
                             <w:r>
                               <w:rPr>
                                 <w:rFonts w:ascii="Calibri" w:eastAsia="Calibri" w:hAnsi="Calibri" w:cs="Calibri"/>
+                                <w:b/>
+                                <w:bCs/>
                                 <w:color w:val="000000"/>
                                 <w:sz w:val="44"/>
                               </w:rPr>
@@ -2372,6 +2384,10 @@
                               <w:spacing w:line="275" w:lineRule="auto"/>
                               <w:jc w:val="center"/>
                               <w:textDirection w:val="btLr"/>
+                              <w:rPr>
+                                <w:sz w:val="32"/>
+                                <w:szCs w:val="32"/>
+                              </w:rPr>
                             </w:pPr>
                             <w:r>
                               <w:rPr>
@@ -2379,6 +2395,7 @@
                                 <w:b/>
                                 <w:color w:val="000000"/>
                                 <w:sz w:val="32"/>
+                                <w:szCs w:val="32"/>
                               </w:rPr>
                               <w:t>Fecha</w:t>
                             </w:r>
@@ -2393,7 +2410,6 @@
                               <w:rPr>
                                 <w:rFonts w:ascii="Calibri" w:eastAsia="Calibri" w:hAnsi="Calibri" w:cs="Calibri"/>
                                 <w:color w:val="000000"/>
-                                <w:sz w:val="32"/>
                               </w:rPr>
                               <w:t>1</w:t>
                             </w:r>
@@ -2401,7 +2417,6 @@
                               <w:rPr>
                                 <w:rFonts w:ascii="Calibri" w:eastAsia="Calibri" w:hAnsi="Calibri" w:cs="Calibri"/>
                                 <w:color w:val="000000"/>
-                                <w:sz w:val="32"/>
                               </w:rPr>
                               <w:t>7</w:t>
                             </w:r>
@@ -2409,7 +2424,6 @@
                               <w:rPr>
                                 <w:rFonts w:ascii="Calibri" w:eastAsia="Calibri" w:hAnsi="Calibri" w:cs="Calibri"/>
                                 <w:color w:val="000000"/>
-                                <w:sz w:val="32"/>
                               </w:rPr>
                               <w:t>/04/2026</w:t>
                             </w:r>
@@ -2451,10 +2465,16 @@
                         <w:spacing w:line="275" w:lineRule="auto"/>
                         <w:jc w:val="center"/>
                         <w:textDirection w:val="btLr"/>
+                        <w:rPr>
+                          <w:b/>
+                          <w:bCs/>
+                        </w:rPr>
                       </w:pPr>
                       <w:r>
                         <w:rPr>
                           <w:rFonts w:ascii="Calibri" w:eastAsia="Calibri" w:hAnsi="Calibri" w:cs="Calibri"/>
+                          <w:b/>
+                          <w:bCs/>
                           <w:color w:val="000000"/>
                           <w:sz w:val="44"/>
                         </w:rPr>
@@ -2463,6 +2483,8 @@
                       <w:r>
                         <w:rPr>
                           <w:rFonts w:ascii="Calibri" w:eastAsia="Calibri" w:hAnsi="Calibri" w:cs="Calibri"/>
+                          <w:b/>
+                          <w:bCs/>
                           <w:color w:val="000000"/>
                           <w:sz w:val="44"/>
                         </w:rPr>
@@ -2471,6 +2493,8 @@
                       <w:r>
                         <w:rPr>
                           <w:rFonts w:ascii="Calibri" w:eastAsia="Calibri" w:hAnsi="Calibri" w:cs="Calibri"/>
+                          <w:b/>
+                          <w:bCs/>
                           <w:color w:val="000000"/>
                           <w:sz w:val="44"/>
                         </w:rPr>
@@ -2479,6 +2503,8 @@
                       <w:r>
                         <w:rPr>
                           <w:rFonts w:ascii="Calibri" w:eastAsia="Calibri" w:hAnsi="Calibri" w:cs="Calibri"/>
+                          <w:b/>
+                          <w:bCs/>
                           <w:color w:val="000000"/>
                           <w:sz w:val="44"/>
                         </w:rPr>
@@ -2668,6 +2694,10 @@
                         <w:spacing w:line="275" w:lineRule="auto"/>
                         <w:jc w:val="center"/>
                         <w:textDirection w:val="btLr"/>
+                        <w:rPr>
+                          <w:sz w:val="32"/>
+                          <w:szCs w:val="32"/>
+                        </w:rPr>
                       </w:pPr>
                       <w:r>
                         <w:rPr>
@@ -2675,6 +2705,7 @@
                           <w:b/>
                           <w:color w:val="000000"/>
                           <w:sz w:val="32"/>
+                          <w:szCs w:val="32"/>
                         </w:rPr>
                         <w:t>Fecha</w:t>
                       </w:r>
@@ -2689,7 +2720,6 @@
                         <w:rPr>
                           <w:rFonts w:ascii="Calibri" w:eastAsia="Calibri" w:hAnsi="Calibri" w:cs="Calibri"/>
                           <w:color w:val="000000"/>
-                          <w:sz w:val="32"/>
                         </w:rPr>
                         <w:t>1</w:t>
                       </w:r>
@@ -2697,7 +2727,6 @@
                         <w:rPr>
                           <w:rFonts w:ascii="Calibri" w:eastAsia="Calibri" w:hAnsi="Calibri" w:cs="Calibri"/>
                           <w:color w:val="000000"/>
-                          <w:sz w:val="32"/>
                         </w:rPr>
                         <w:t>7</w:t>
                       </w:r>
@@ -2705,7 +2734,6 @@
                         <w:rPr>
                           <w:rFonts w:ascii="Calibri" w:eastAsia="Calibri" w:hAnsi="Calibri" w:cs="Calibri"/>
                           <w:color w:val="000000"/>
-                          <w:sz w:val="32"/>
                         </w:rPr>
                         <w:t>/04/2026</w:t>
                       </w:r>
@@ -8673,13 +8701,7 @@
         </w:numPr>
       </w:pPr>
       <w:r>
-        <w:t xml:space="preserve">Asignación de asientos individuales y numerados dentro de las localidades del </w:t>
-      </w:r>
-      <w:r>
-        <w:t>disponibles</w:t>
-      </w:r>
-      <w:r>
-        <w:t>.</w:t>
+        <w:t>Asignación de asientos individuales y numerados dentro de las localidades del disponibles.</w:t>
       </w:r>
     </w:p>
     <w:p>
@@ -11678,11 +11700,14 @@
         <w:jc w:val="center"/>
       </w:pPr>
       <w:r>
+        <w:rPr>
+          <w:noProof/>
+        </w:rPr>
         <w:drawing>
-          <wp:inline distT="0" distB="0" distL="0" distR="0" wp14:anchorId="54057B47" wp14:editId="71572463">
-            <wp:extent cx="5553850" cy="4467849"/>
-            <wp:effectExtent l="0" t="0" r="0" b="9525"/>
-            <wp:docPr id="833774395" name="Imagen 1"/>
+          <wp:inline distT="0" distB="0" distL="0" distR="0" wp14:anchorId="666F2B61" wp14:editId="22D0A110">
+            <wp:extent cx="4972511" cy="5029200"/>
+            <wp:effectExtent l="0" t="0" r="0" b="0"/>
+            <wp:docPr id="1372582518" name="Imagen 1"/>
             <wp:cNvGraphicFramePr>
               <a:graphicFrameLocks xmlns:a="http://schemas.openxmlformats.org/drawingml/2006/main" noChangeAspect="1"/>
             </wp:cNvGraphicFramePr>
@@ -11690,7 +11715,7 @@
               <a:graphicData uri="http://schemas.openxmlformats.org/drawingml/2006/picture">
                 <pic:pic xmlns:pic="http://schemas.openxmlformats.org/drawingml/2006/picture">
                   <pic:nvPicPr>
-                    <pic:cNvPr id="833774395" name=""/>
+                    <pic:cNvPr id="1372582518" name=""/>
                     <pic:cNvPicPr/>
                   </pic:nvPicPr>
                   <pic:blipFill>
@@ -11702,7 +11727,7 @@
                   <pic:spPr>
                     <a:xfrm>
                       <a:off x="0" y="0"/>
-                      <a:ext cx="5553850" cy="4467849"/>
+                      <a:ext cx="4985687" cy="5042526"/>
                     </a:xfrm>
                     <a:prstGeom prst="rect">
                       <a:avLst/>
@@ -11732,6 +11757,7 @@
       </w:pPr>
       <w:bookmarkStart w:id="20" w:name="_Toc230054372"/>
       <w:r>
+        <w:lastRenderedPageBreak/>
         <w:t>7.3 Condiciones del Entorno</w:t>
       </w:r>
       <w:bookmarkEnd w:id="20"/>
@@ -11754,7 +11780,6 @@
           <w:b/>
           <w:bCs/>
         </w:rPr>
-        <w:lastRenderedPageBreak/>
         <w:t>Entorno de Servidor (Backend):</w:t>
       </w:r>
       <w:r>
@@ -12170,6 +12195,7 @@
           <w:b/>
           <w:bCs/>
         </w:rPr>
+        <w:lastRenderedPageBreak/>
         <w:t>Interface</w:t>
       </w:r>
       <w:proofErr w:type="gramEnd"/>
@@ -12206,7 +12232,6 @@
       </w:pPr>
       <w:bookmarkStart w:id="25" w:name="_Toc230054375"/>
       <w:r>
-        <w:lastRenderedPageBreak/>
         <w:t>7.6 Restricciones</w:t>
       </w:r>
       <w:bookmarkEnd w:id="25"/>
@@ -12522,7 +12547,11 @@
     </w:p>
     <w:p>
       <w:r>
-        <w:t>El sistema presenta interfaces adaptadas unificadas por un flujo lógico que interconectan múltiples plataformas. En plataformas visuales (.NET MAUI y Web Blazor), el sistema presenta siempre de entrada formularios de acceso y registro amigables, pidiendo validaciones de cédula antes de enviar tramas (</w:t>
+        <w:t xml:space="preserve">El sistema presenta interfaces adaptadas unificadas por un flujo lógico que interconectan múltiples plataformas. En plataformas visuales (.NET MAUI y Web Blazor), el sistema presenta siempre de entrada formularios de acceso y registro amigables, pidiendo </w:t>
+      </w:r>
+      <w:r>
+        <w:lastRenderedPageBreak/>
+        <w:t>validaciones de cédula antes de enviar tramas (</w:t>
       </w:r>
       <w:proofErr w:type="spellStart"/>
       <w:r>
@@ -12552,7 +12581,6 @@
     <w:p/>
     <w:p>
       <w:r>
-        <w:lastRenderedPageBreak/>
         <w:t>El entorno de compra es de exploración dinámica: despliega listados y selectores que mapean los partidos obtenidos en tiempo real de la base de datos enrutada, un selector de localidades, el precio traído por el servidor y componentes numéricos para seleccionar la cantidad de boletos a comprar (controlando el exceso de stock). Los reportes y facturación se muestran como grillas informativas (Tablas) que renderizan su historial de transacciones.</w:t>
       </w:r>
     </w:p>
@@ -13218,47 +13246,47 @@
                 <w:sz w:val="20"/>
                 <w:szCs w:val="20"/>
               </w:rPr>
-              <w:t>- Frecuencia de actualización: 60 Hz.</w:t>
-            </w:r>
-          </w:p>
-          <w:p>
-            <w:pPr>
-              <w:cnfStyle w:val="000000100000" w:firstRow="0" w:lastRow="0" w:firstColumn="0" w:lastColumn="0" w:oddVBand="0" w:evenVBand="0" w:oddHBand="1" w:evenHBand="0" w:firstRowFirstColumn="0" w:firstRowLastColumn="0" w:lastRowFirstColumn="0" w:lastRowLastColumn="0"/>
+              <w:t xml:space="preserve">- Frecuencia de </w:t>
+            </w:r>
+            <w:r>
               <w:rPr>
                 <w:sz w:val="20"/>
                 <w:szCs w:val="20"/>
               </w:rPr>
-            </w:pPr>
-            <w:r>
+              <w:lastRenderedPageBreak/>
+              <w:t>actualización: 60 Hz.</w:t>
+            </w:r>
+          </w:p>
+          <w:p>
+            <w:pPr>
+              <w:cnfStyle w:val="000000100000" w:firstRow="0" w:lastRow="0" w:firstColumn="0" w:lastColumn="0" w:oddVBand="0" w:evenVBand="0" w:oddHBand="1" w:evenHBand="0" w:firstRowFirstColumn="0" w:firstRowLastColumn="0" w:lastRowFirstColumn="0" w:lastRowLastColumn="0"/>
               <w:rPr>
                 <w:sz w:val="20"/>
                 <w:szCs w:val="20"/>
               </w:rPr>
-              <w:t xml:space="preserve">- Colores Admitidos: 16.7 millones </w:t>
-            </w:r>
-          </w:p>
-          <w:p>
-            <w:pPr>
-              <w:cnfStyle w:val="000000100000" w:firstRow="0" w:lastRow="0" w:firstColumn="0" w:lastColumn="0" w:oddVBand="0" w:evenVBand="0" w:oddHBand="1" w:evenHBand="0" w:firstRowFirstColumn="0" w:firstRowLastColumn="0" w:lastRowFirstColumn="0" w:lastRowLastColumn="0"/>
+            </w:pPr>
+            <w:r>
               <w:rPr>
                 <w:sz w:val="20"/>
                 <w:szCs w:val="20"/>
               </w:rPr>
-            </w:pPr>
-            <w:r>
+              <w:t xml:space="preserve">- Colores Admitidos: 16.7 millones </w:t>
+            </w:r>
+          </w:p>
+          <w:p>
+            <w:pPr>
+              <w:cnfStyle w:val="000000100000" w:firstRow="0" w:lastRow="0" w:firstColumn="0" w:lastColumn="0" w:oddVBand="0" w:evenVBand="0" w:oddHBand="1" w:evenHBand="0" w:firstRowFirstColumn="0" w:firstRowLastColumn="0" w:lastRowFirstColumn="0" w:lastRowLastColumn="0"/>
               <w:rPr>
                 <w:sz w:val="20"/>
                 <w:szCs w:val="20"/>
               </w:rPr>
-              <w:t xml:space="preserve">- Relación de Contraste: </w:t>
-            </w:r>
+            </w:pPr>
             <w:r>
               <w:rPr>
                 <w:sz w:val="20"/>
                 <w:szCs w:val="20"/>
               </w:rPr>
-              <w:lastRenderedPageBreak/>
-              <w:t xml:space="preserve">100,000,000:1 </w:t>
+              <w:t xml:space="preserve">- Relación de Contraste: 100,000,000:1 </w:t>
             </w:r>
           </w:p>
           <w:p>
@@ -14176,6 +14204,7 @@
               <w:rPr>
                 <w:rFonts w:ascii="Arial Narrow" w:eastAsia="Arial Narrow" w:hAnsi="Arial Narrow" w:cs="Arial Narrow"/>
               </w:rPr>
+              <w:lastRenderedPageBreak/>
               <w:t>Sistema Operativo Cliente (Consola y Escritorio)</w:t>
             </w:r>
           </w:p>
@@ -14236,7 +14265,6 @@
               <w:rPr>
                 <w:rFonts w:ascii="Arial Narrow" w:eastAsia="Arial Narrow" w:hAnsi="Arial Narrow" w:cs="Arial Narrow"/>
               </w:rPr>
-              <w:lastRenderedPageBreak/>
               <w:t>Entorno de ejecución para cliente de consola y cliente de escritorio (si aplica).</w:t>
             </w:r>
           </w:p>
@@ -15108,7 +15136,11 @@
         </w:numPr>
       </w:pPr>
       <w:r>
-        <w:t xml:space="preserve">Toda petición de los clientes debe alcanzar el servidor WCF apuntando a sus respectivas </w:t>
+        <w:t xml:space="preserve">Toda petición de los clientes debe alcanzar el servidor WCF apuntando a sus </w:t>
+      </w:r>
+      <w:r>
+        <w:lastRenderedPageBreak/>
+        <w:t xml:space="preserve">respectivas </w:t>
       </w:r>
       <w:proofErr w:type="spellStart"/>
       <w:r>
@@ -15142,7 +15174,6 @@
     </w:p>
     <w:p>
       <w:r>
-        <w:lastRenderedPageBreak/>
         <w:t>Proporcionar una solución comercial distribuida y segura que permita a los usuarios registrarse, explorar inventarios en tiempo real de eventos futbolísticos y ejecutar transacciones de facturación de boletos, actualizando consiguientemente los inventarios orquestados de un segundo servicio (Federación). Todo respaldado mediante persistencia en base de datos.</w:t>
       </w:r>
     </w:p>
@@ -15554,6 +15585,7 @@
       </w:pPr>
       <w:bookmarkStart w:id="39" w:name="_Toc230054413"/>
       <w:r>
+        <w:lastRenderedPageBreak/>
         <w:t xml:space="preserve">Tabla </w:t>
       </w:r>
       <w:r>
@@ -15641,11 +15673,7 @@
               <w:cnfStyle w:val="000000100000" w:firstRow="0" w:lastRow="0" w:firstColumn="0" w:lastColumn="0" w:oddVBand="0" w:evenVBand="0" w:oddHBand="1" w:evenHBand="0" w:firstRowFirstColumn="0" w:firstRowLastColumn="0" w:lastRowFirstColumn="0" w:lastRowLastColumn="0"/>
             </w:pPr>
             <w:r>
-              <w:t xml:space="preserve">Ejecutar la transacción de compra de boletos validando la disponibilidad de asientos (stock y cupo) y generando el registro </w:t>
-            </w:r>
-            <w:r>
-              <w:lastRenderedPageBreak/>
-              <w:t xml:space="preserve">de Factura en </w:t>
+              <w:t xml:space="preserve">Ejecutar la transacción de compra de boletos validando la disponibilidad de asientos (stock y cupo) y generando el registro de Factura en </w:t>
             </w:r>
             <w:proofErr w:type="spellStart"/>
             <w:r>
@@ -15682,7 +15710,6 @@
           </w:tcPr>
           <w:p>
             <w:r>
-              <w:lastRenderedPageBreak/>
               <w:t xml:space="preserve">Importancia </w:t>
             </w:r>
           </w:p>
@@ -16077,13 +16104,7 @@
               <w:rPr>
                 <w:rFonts w:eastAsia="Verdana"/>
               </w:rPr>
-              <w:t>Persona que busca consultar la oferta de partidos de la federación y adquirir boletos mediante su cuenta.</w:t>
-            </w:r>
-            <w:r>
-              <w:rPr>
-                <w:rFonts w:eastAsia="Verdana"/>
-              </w:rPr>
-              <w:t xml:space="preserve"> </w:t>
+              <w:t xml:space="preserve">Persona que busca consultar la oferta de partidos de la federación y adquirir boletos mediante su cuenta. </w:t>
             </w:r>
           </w:p>
         </w:tc>
@@ -16133,13 +16154,7 @@
               <w:rPr>
                 <w:rFonts w:eastAsia="Verdana"/>
               </w:rPr>
-              <w:t>Consume el software mediante PC (Consola o Escritorio), Smartphone o Navegador Web (Blazor).</w:t>
-            </w:r>
-            <w:r>
-              <w:rPr>
-                <w:rFonts w:eastAsia="Verdana"/>
-              </w:rPr>
-              <w:t xml:space="preserve"> </w:t>
+              <w:t xml:space="preserve">Consume el software mediante PC (Consola o Escritorio), Smartphone o Navegador Web (Blazor). </w:t>
             </w:r>
           </w:p>
         </w:tc>
@@ -16233,6 +16248,7 @@
       </w:pPr>
       <w:bookmarkStart w:id="43" w:name="_Toc230054386"/>
       <w:r>
+        <w:lastRenderedPageBreak/>
         <w:t>8.2.4. Lista de requisitos funcionales</w:t>
       </w:r>
       <w:bookmarkEnd w:id="43"/>
@@ -16285,7 +16301,6 @@
       </w:pPr>
       <w:bookmarkStart w:id="44" w:name="_Toc230054416"/>
       <w:r>
-        <w:lastRenderedPageBreak/>
         <w:t>Tabla 1</w:t>
       </w:r>
       <w:r>
@@ -16886,10 +16901,7 @@
       </w:r>
       <w:proofErr w:type="gramEnd"/>
       <w:r>
-        <w:t xml:space="preserve"> Premium Monster</w:t>
-      </w:r>
-      <w:r>
-        <w:t xml:space="preserve"> </w:t>
+        <w:t xml:space="preserve"> Premium Monster </w:t>
       </w:r>
       <w:r>
         <w:t>se han identificado los siguientes detalles técnicos por requerimiento.</w:t>
@@ -17070,13 +17082,7 @@
               <w:rPr>
                 <w:rFonts w:ascii="Verdana" w:eastAsia="Verdana" w:hAnsi="Verdana" w:cs="Verdana"/>
               </w:rPr>
-              <w:t>.</w:t>
-            </w:r>
-            <w:r>
-              <w:rPr>
-                <w:rFonts w:ascii="Verdana" w:eastAsia="Verdana" w:hAnsi="Verdana" w:cs="Verdana"/>
-              </w:rPr>
-              <w:t xml:space="preserve"> </w:t>
+              <w:t xml:space="preserve">. </w:t>
             </w:r>
           </w:p>
         </w:tc>
@@ -17550,13 +17556,7 @@
               <w:rPr>
                 <w:rFonts w:ascii="Verdana" w:eastAsia="Verdana" w:hAnsi="Verdana" w:cs="Verdana"/>
               </w:rPr>
-              <w:t>. Recibe como parámetro el ID numérico del partido iterando las relaciones en SQL Server para retornar el stock y configuración de zonas habilitadas correspondientes Localidades.</w:t>
-            </w:r>
-            <w:r>
-              <w:rPr>
-                <w:rFonts w:ascii="Verdana" w:eastAsia="Verdana" w:hAnsi="Verdana" w:cs="Verdana"/>
-              </w:rPr>
-              <w:t xml:space="preserve"> </w:t>
+              <w:t xml:space="preserve">. Recibe como parámetro el ID numérico del partido iterando las relaciones en SQL Server para retornar el stock y configuración de zonas habilitadas correspondientes Localidades. </w:t>
             </w:r>
           </w:p>
         </w:tc>
@@ -17912,6 +17912,7 @@
               </w:pBdr>
             </w:pPr>
             <w:r>
+              <w:lastRenderedPageBreak/>
               <w:t>RQF-003</w:t>
             </w:r>
           </w:p>
@@ -18031,20 +18032,7 @@
               <w:rPr>
                 <w:rFonts w:ascii="Verdana" w:eastAsia="Verdana" w:hAnsi="Verdana" w:cs="Verdana"/>
               </w:rPr>
-              <w:t xml:space="preserve"> y la cantidad de alteración. Debe modificar </w:t>
-            </w:r>
-            <w:r>
-              <w:rPr>
-                <w:rFonts w:ascii="Verdana" w:eastAsia="Verdana" w:hAnsi="Verdana" w:cs="Verdana"/>
-              </w:rPr>
-              <w:lastRenderedPageBreak/>
-              <w:t>relacionalmente la tabla en SQL Server afectando de forma persistente los asientos libres.</w:t>
-            </w:r>
-            <w:r>
-              <w:rPr>
-                <w:rFonts w:ascii="Verdana" w:eastAsia="Verdana" w:hAnsi="Verdana" w:cs="Verdana"/>
-              </w:rPr>
-              <w:t xml:space="preserve"> </w:t>
+              <w:t xml:space="preserve"> y la cantidad de alteración. Debe modificar relacionalmente la tabla en SQL Server afectando de forma persistente los asientos libres. </w:t>
             </w:r>
           </w:p>
         </w:tc>
@@ -18066,7 +18054,6 @@
               </w:pBdr>
             </w:pPr>
             <w:r>
-              <w:lastRenderedPageBreak/>
               <w:t>Objetivo</w:t>
             </w:r>
           </w:p>
@@ -18517,13 +18504,7 @@
               <w:rPr>
                 <w:rFonts w:ascii="Verdana" w:eastAsia="Verdana" w:hAnsi="Verdana" w:cs="Verdana"/>
               </w:rPr>
-              <w:t xml:space="preserve"> y consume al servicio orquestado de la Federación y transfiere en bruto la lista al usuario.</w:t>
-            </w:r>
-            <w:r>
-              <w:rPr>
-                <w:rFonts w:ascii="Verdana" w:eastAsia="Verdana" w:hAnsi="Verdana" w:cs="Verdana"/>
-              </w:rPr>
-              <w:t xml:space="preserve"> </w:t>
+              <w:t xml:space="preserve"> y consume al servicio orquestado de la Federación y transfiere en bruto la lista al usuario. </w:t>
             </w:r>
           </w:p>
         </w:tc>
@@ -18963,13 +18944,7 @@
               <w:rPr>
                 <w:rFonts w:ascii="Verdana" w:eastAsia="Verdana" w:hAnsi="Verdana" w:cs="Verdana"/>
               </w:rPr>
-              <w:t>), el usuario solicita información específica de precios y disponibilidades, que a su vez se nutre desde la Federación para renderizar los selectores de pantalla.</w:t>
-            </w:r>
-            <w:r>
-              <w:rPr>
-                <w:rFonts w:ascii="Verdana" w:eastAsia="Verdana" w:hAnsi="Verdana" w:cs="Verdana"/>
-              </w:rPr>
-              <w:t xml:space="preserve"> </w:t>
+              <w:t xml:space="preserve">), el usuario solicita información específica de precios y disponibilidades, que a su vez se nutre desde la Federación para renderizar los selectores de pantalla. </w:t>
             </w:r>
           </w:p>
         </w:tc>
@@ -19024,6 +18999,7 @@
           </w:tcPr>
           <w:p>
             <w:r>
+              <w:lastRenderedPageBreak/>
               <w:t>Importancia</w:t>
             </w:r>
           </w:p>
@@ -19126,7 +19102,6 @@
           </w:tcPr>
           <w:p>
             <w:r>
-              <w:lastRenderedPageBreak/>
               <w:t>Comentarios</w:t>
             </w:r>
           </w:p>
@@ -19637,13 +19612,7 @@
       </w:pPr>
       <w:bookmarkStart w:id="52" w:name="_Toc230054423"/>
       <w:r>
-        <w:t xml:space="preserve">Tabla </w:t>
-      </w:r>
-      <w:r>
-        <w:t>20</w:t>
-      </w:r>
-      <w:r>
-        <w:t xml:space="preserve">. </w:t>
+        <w:t xml:space="preserve">Tabla 20. </w:t>
       </w:r>
       <w:r>
         <w:rPr>
@@ -19840,13 +19809,7 @@
               <w:rPr>
                 <w:rFonts w:ascii="Verdana" w:eastAsia="Verdana" w:hAnsi="Verdana" w:cs="Verdana"/>
               </w:rPr>
-              <w:t>OBJ-00</w:t>
-            </w:r>
-            <w:r>
-              <w:rPr>
-                <w:rFonts w:ascii="Verdana" w:eastAsia="Verdana" w:hAnsi="Verdana" w:cs="Verdana"/>
-              </w:rPr>
-              <w:t>4</w:t>
+              <w:t>OBJ-004</w:t>
             </w:r>
           </w:p>
         </w:tc>
@@ -20006,6 +19969,7 @@
                 <w:bCs/>
                 <w:color w:val="FFFFFF"/>
               </w:rPr>
+              <w:lastRenderedPageBreak/>
               <w:t>Comentarios</w:t>
             </w:r>
           </w:p>
@@ -22190,10 +22154,7 @@
       </w:r>
       <w:proofErr w:type="gramStart"/>
       <w:r>
-        <w:t>temporales.</w:t>
-      </w:r>
-      <w:r>
-        <w:t>.</w:t>
+        <w:t>temporales..</w:t>
       </w:r>
       <w:proofErr w:type="gramEnd"/>
     </w:p>
@@ -22960,7 +22921,7 @@
       <w:pPr>
         <w:ind w:left="720" w:hanging="720"/>
         <w:rPr>
-          <w:lang w:val="es-EC"/>
+          <w:lang w:val="en-US"/>
         </w:rPr>
       </w:pPr>
       <w:r>
@@ -22981,7 +22942,13 @@
         <w:rPr>
           <w:lang w:val="es-EC"/>
         </w:rPr>
-        <w:t>.). Patrones de arquitectura distribuida en plataformas SOA y WSDL. Recuperado de https://learn.microsoft.com/dotnet/architecture/</w:t>
+        <w:t xml:space="preserve">.). Patrones de arquitectura distribuida en plataformas SOA y WSDL. </w:t>
+      </w:r>
+      <w:r>
+        <w:rPr>
+          <w:lang w:val="en-US"/>
+        </w:rPr>
+        <w:t>Recuperado de https://learn.microsoft.com/dotnet/architecture/</w:t>
       </w:r>
     </w:p>
     <w:p>
@@ -22993,6 +22960,32 @@
       </w:pPr>
       <w:r>
         <w:rPr>
+          <w:lang w:val="en-US"/>
+        </w:rPr>
+        <w:t>Microsoft. (n.d.). .</w:t>
+      </w:r>
+      <w:r>
+        <w:rPr>
+          <w:lang w:val="en-US"/>
+        </w:rPr>
+        <w:t xml:space="preserve">NET MAUI documentation: Build native apps across multiple platforms. </w:t>
+      </w:r>
+      <w:r>
+        <w:rPr>
+          <w:lang w:val="es-EC"/>
+        </w:rPr>
+        <w:t>Recuperado de https://learn.microsoft.com/dotnet/maui/</w:t>
+      </w:r>
+    </w:p>
+    <w:p>
+      <w:pPr>
+        <w:ind w:left="720" w:hanging="720"/>
+        <w:rPr>
+          <w:lang w:val="es-EC"/>
+        </w:rPr>
+      </w:pPr>
+      <w:r>
+        <w:rPr>
           <w:lang w:val="es-EC"/>
         </w:rPr>
         <w:t>Microsoft. (</w:t>
@@ -23009,33 +23002,35 @@
         <w:rPr>
           <w:lang w:val="es-EC"/>
         </w:rPr>
-        <w:t>.). .</w:t>
-      </w:r>
-      <w:r>
+        <w:t xml:space="preserve">.). ASP.NET Core Blazor </w:t>
+      </w:r>
+      <w:proofErr w:type="spellStart"/>
+      <w:r>
+        <w:rPr>
+          <w:lang w:val="es-EC"/>
+        </w:rPr>
+        <w:t>documentation</w:t>
+      </w:r>
+      <w:proofErr w:type="spellEnd"/>
+      <w:r>
+        <w:rPr>
+          <w:lang w:val="es-EC"/>
+        </w:rPr>
+        <w:t>. Recuperado de https://learn.microsoft.com/aspnet/core/blazor/</w:t>
+      </w:r>
+    </w:p>
+    <w:p>
+      <w:pPr>
+        <w:ind w:left="720" w:hanging="720"/>
         <w:rPr>
           <w:lang w:val="en-US"/>
         </w:rPr>
-        <w:t xml:space="preserve">NET MAUI documentation: Build native </w:t>
-      </w:r>
-      <w:proofErr w:type="gramStart"/>
+      </w:pPr>
       <w:r>
         <w:rPr>
           <w:lang w:val="en-US"/>
         </w:rPr>
-        <w:t>apps</w:t>
-      </w:r>
-      <w:proofErr w:type="gramEnd"/>
-      <w:r>
-        <w:rPr>
-          <w:lang w:val="en-US"/>
-        </w:rPr>
-        <w:t xml:space="preserve"> across multiple platforms. </w:t>
-      </w:r>
-      <w:r>
-        <w:rPr>
-          <w:lang w:val="es-EC"/>
-        </w:rPr>
-        <w:t>Recuperado de https://learn.microsoft.com/dotnet/maui/</w:t>
+        <w:t>Erl, T. (2005). Service-Oriented Architecture: Concepts, Technology, and Design. Prentice Hall.</w:t>
       </w:r>
     </w:p>
     <w:p>
@@ -23047,37 +23042,15 @@
       </w:pPr>
       <w:r>
         <w:rPr>
-          <w:lang w:val="es-EC"/>
+          <w:lang w:val="en-US"/>
         </w:rPr>
-        <w:t>Microsoft. (</w:t>
-      </w:r>
-      <w:proofErr w:type="spellStart"/>
+        <w:t xml:space="preserve">World Wide Web Consortium (W3C). (2007). SOAP Version 1.2 Specification. </w:t>
+      </w:r>
       <w:r>
         <w:rPr>
           <w:lang w:val="es-EC"/>
         </w:rPr>
-        <w:t>n.d</w:t>
-      </w:r>
-      <w:proofErr w:type="spellEnd"/>
-      <w:r>
-        <w:rPr>
-          <w:lang w:val="es-EC"/>
-        </w:rPr>
-        <w:t xml:space="preserve">.). ASP.NET Core Blazor </w:t>
-      </w:r>
-      <w:proofErr w:type="spellStart"/>
-      <w:r>
-        <w:rPr>
-          <w:lang w:val="es-EC"/>
-        </w:rPr>
-        <w:t>documentation</w:t>
-      </w:r>
-      <w:proofErr w:type="spellEnd"/>
-      <w:r>
-        <w:rPr>
-          <w:lang w:val="es-EC"/>
-        </w:rPr>
-        <w:t>. Recuperado de https://learn.microsoft.com/aspnet/core/blazor/</w:t>
+        <w:t>Recuperado de https://www.w3.org/TR/soap12/</w:t>
       </w:r>
     </w:p>
     <w:p>
@@ -23089,65 +23062,15 @@
       </w:pPr>
       <w:r>
         <w:rPr>
-          <w:lang w:val="en-US"/>
+          <w:lang w:val="es-EC"/>
         </w:rPr>
-        <w:t>Erl, T. (2005). Service-Oriented Architecture: Concepts, Technology, and Design. Prentice Hall.</w:t>
-      </w:r>
-    </w:p>
-    <w:p>
-      <w:pPr>
-        <w:ind w:left="720" w:hanging="720"/>
+        <w:t xml:space="preserve">Provos, N., &amp; Mazières, D. (1999). </w:t>
+      </w:r>
+      <w:r>
         <w:rPr>
           <w:lang w:val="en-US"/>
         </w:rPr>
-      </w:pPr>
-      <w:r>
-        <w:rPr>
-          <w:lang w:val="en-US"/>
-        </w:rPr>
-        <w:t xml:space="preserve">World Wide Web Consortium (W3C). (2007). SOAP Version 1.2 Specification. </w:t>
-      </w:r>
-      <w:proofErr w:type="spellStart"/>
-      <w:r>
-        <w:rPr>
-          <w:lang w:val="en-US"/>
-        </w:rPr>
-        <w:t>Recuperado</w:t>
-      </w:r>
-      <w:proofErr w:type="spellEnd"/>
-      <w:r>
-        <w:rPr>
-          <w:lang w:val="en-US"/>
-        </w:rPr>
-        <w:t xml:space="preserve"> de https://www.w3.org/TR/soap12/</w:t>
-      </w:r>
-    </w:p>
-    <w:p>
-      <w:pPr>
-        <w:ind w:left="720" w:hanging="720"/>
-        <w:rPr>
-          <w:lang w:val="en-US"/>
-        </w:rPr>
-      </w:pPr>
-      <w:r>
-        <w:rPr>
-          <w:lang w:val="en-US"/>
-        </w:rPr>
-        <w:t xml:space="preserve">Provos, N., &amp; </w:t>
-      </w:r>
-      <w:proofErr w:type="spellStart"/>
-      <w:r>
-        <w:rPr>
-          <w:lang w:val="en-US"/>
-        </w:rPr>
-        <w:t>Mazières</w:t>
-      </w:r>
-      <w:proofErr w:type="spellEnd"/>
-      <w:r>
-        <w:rPr>
-          <w:lang w:val="en-US"/>
-        </w:rPr>
-        <w:t>, D. (1999). A Future-Adaptable Password Scheme (</w:t>
+        <w:t>A Future-Adaptable Password Scheme (</w:t>
       </w:r>
       <w:proofErr w:type="spellStart"/>
       <w:r>
@@ -28702,6 +28625,7 @@
   <w:style w:type="character" w:default="1" w:styleId="Fuentedeprrafopredeter">
     <w:name w:val="Default Paragraph Font"/>
     <w:uiPriority w:val="1"/>
+    <w:semiHidden/>
     <w:unhideWhenUsed/>
   </w:style>
   <w:style w:type="table" w:default="1" w:styleId="Tablanormal">

</xml_diff>